<commit_message>
feat(scotus-fonts): doc-type templates, exemplars, overlays (fb-595.7.5.164)
Hand-landed from run 0cae74e0817e66609f02e34c on its snapshot base; the patch no longer applied to master.
</commit_message>
<xml_diff>
--- a/courts/supreme-court-of-the-united-states/amicus-brief/docx/reference.docx
+++ b/courts/supreme-court-of-the-united-states/amicus-brief/docx/reference.docx
@@ -487,7 +487,7 @@
   <w:docDefaults>
     <w:rPrDefault>
       <w:rPr>
-        <w:rFonts w:ascii="EB Garamond" w:hAnsi="EB Garamond" w:eastAsia="EB Garamond" w:cs="EB Garamond"/>
+        <w:rFonts w:ascii="TeX Gyre Schola" w:hAnsi="TeX Gyre Schola" w:eastAsia="TeX Gyre Schola" w:cs="TeX Gyre Schola"/>
         <w:sz w:val="24"/>
         <w:szCs w:val="24"/>
         <w:lang w:val="en-US" w:eastAsia="zh-CN" w:bidi="ar-SA"/>
@@ -542,7 +542,7 @@
       <w:jc w:val="center"/>
     </w:pPr>
     <w:rPr>
-      <w:rFonts w:asciiTheme="majorHAnsi" w:eastAsiaTheme="majorEastAsia" w:hAnsiTheme="majorHAnsi" w:cstheme="majorBidi"/>
+      <w:rFonts w:ascii="TeX Gyre Schola" w:eastAsiaTheme="majorEastAsia" w:hAnsi="TeX Gyre Schola" w:cstheme="majorBidi"/>
       <w:sz w:val="56"/>
       <w:szCs w:val="56"/>
     </w:rPr>
@@ -554,7 +554,7 @@
     <w:uiPriority w:val="10"/>
     <w:rsid w:val="00A10FD9"/>
     <w:rPr>
-      <w:rFonts w:asciiTheme="majorHAnsi" w:eastAsiaTheme="majorEastAsia" w:hAnsiTheme="majorHAnsi" w:cstheme="majorBidi"/>
+      <w:rFonts w:ascii="TeX Gyre Schola" w:eastAsiaTheme="majorEastAsia" w:hAnsi="TeX Gyre Schola" w:cstheme="majorBidi"/>
       <w:sz w:val="56"/>
       <w:szCs w:val="56"/>
     </w:rPr>
@@ -676,7 +676,7 @@
       <w:outlineLvl w:val="0"/>
     </w:pPr>
     <w:rPr>
-      <w:rFonts w:asciiTheme="majorHAnsi" w:eastAsiaTheme="majorEastAsia" w:hAnsiTheme="majorHAnsi" w:cstheme="majorBidi"/>
+      <w:rFonts w:ascii="TeX Gyre Schola" w:eastAsiaTheme="majorEastAsia" w:hAnsi="TeX Gyre Schola" w:cstheme="majorBidi"/>
       <w:color w:val="0F4761" w:themeColor="accent1" w:themeShade="BF"/>
       <w:sz w:val="40"/>
       <w:szCs w:val="40"/>
@@ -699,7 +699,7 @@
       <w:outlineLvl w:val="1"/>
     </w:pPr>
     <w:rPr>
-      <w:rFonts w:asciiTheme="majorHAnsi" w:eastAsiaTheme="majorEastAsia" w:hAnsiTheme="majorHAnsi" w:cstheme="majorBidi"/>
+      <w:rFonts w:ascii="TeX Gyre Schola" w:eastAsiaTheme="majorEastAsia" w:hAnsi="TeX Gyre Schola" w:cstheme="majorBidi"/>
       <w:color w:val="0F4761" w:themeColor="accent1" w:themeShade="BF"/>
       <w:sz w:val="32"/>
       <w:szCs w:val="32"/>
@@ -867,7 +867,7 @@
     <w:uiPriority w:val="9"/>
     <w:rsid w:val="00A10FD9"/>
     <w:rPr>
-      <w:rFonts w:asciiTheme="majorHAnsi" w:eastAsiaTheme="majorEastAsia" w:hAnsiTheme="majorHAnsi" w:cstheme="majorBidi"/>
+      <w:rFonts w:ascii="TeX Gyre Schola" w:eastAsiaTheme="majorEastAsia" w:hAnsi="TeX Gyre Schola" w:cstheme="majorBidi"/>
       <w:color w:val="0F4761" w:themeColor="accent1" w:themeShade="BF"/>
       <w:sz w:val="40"/>
       <w:szCs w:val="40"/>
@@ -881,7 +881,7 @@
     <w:semiHidden/>
     <w:rsid w:val="00A10FD9"/>
     <w:rPr>
-      <w:rFonts w:asciiTheme="majorHAnsi" w:eastAsiaTheme="majorEastAsia" w:hAnsiTheme="majorHAnsi" w:cstheme="majorBidi"/>
+      <w:rFonts w:ascii="TeX Gyre Schola" w:eastAsiaTheme="majorEastAsia" w:hAnsi="TeX Gyre Schola" w:cstheme="majorBidi"/>
       <w:color w:val="0F4761" w:themeColor="accent1" w:themeShade="BF"/>
       <w:sz w:val="32"/>
       <w:szCs w:val="32"/>
@@ -1138,7 +1138,7 @@
       <w:outlineLvl w:val="9"/>
     </w:pPr>
     <w:rPr>
-      <w:rFonts w:asciiTheme="majorHAnsi" w:eastAsiaTheme="majorEastAsia" w:hAnsiTheme="majorHAnsi" w:cstheme="majorBidi"/>
+      <w:rFonts w:ascii="TeX Gyre Schola" w:eastAsiaTheme="majorEastAsia" w:hAnsi="TeX Gyre Schola" w:cstheme="majorBidi"/>
       <w:b w:val="0"/>
       <w:bCs w:val="0"/>
       <w:color w:val="365F91" w:themeColor="accent1" w:themeShade="BF"/>

</xml_diff>